<commit_message>
docs(thesis): format master docx strictly to Pedoman Tugas Akhir Mahasiswa S1 Unhas 2023
</commit_message>
<xml_diff>
--- a/Thesis/docx_export/MASTER_BIBLIOGRAPHY.docx
+++ b/Thesis/docx_export/MASTER_BIBLIOGRAPHY.docx
@@ -4,1220 +4,1946 @@
   <w:body>
     <w:p>
       <w:pPr>
-        <w:pStyle w:val="Heading1"/>
+        <w:spacing w:before="240" w:after="240"/>
+        <w:jc w:val="center"/>
       </w:pPr>
       <w:r>
-        <w:t>Master Bibliography Registry (Daftar Pustaka Induk)</w:t>
+        <w:rPr>
+          <w:rFonts w:ascii="Arial" w:hAnsi="Arial"/>
+          <w:b/>
+          <w:sz w:val="22"/>
+        </w:rPr>
+        <w:t>DAFTAR PUSTAKA</w:t>
       </w:r>
-      <w:r/>
     </w:p>
     <w:p>
-      <w:r/>
+      <w:pPr>
+        <w:spacing w:after="80" w:line="276" w:lineRule="auto"/>
+        <w:ind w:firstLine="567"/>
+        <w:jc w:val="both"/>
+      </w:pPr>
       <w:r>
+        <w:rPr>
+          <w:rFonts w:ascii="Arial" w:hAnsi="Arial"/>
+          <w:sz w:val="20"/>
+        </w:rPr>
         <w:t>This master bibliography serves as the immutable, synchronized citation registry for the undergraduate thesis:</w:t>
       </w:r>
+    </w:p>
+    <w:p>
+      <w:pPr>
+        <w:spacing w:after="80" w:line="276" w:lineRule="auto"/>
+        <w:ind w:firstLine="567"/>
+        <w:jc w:val="both"/>
+      </w:pPr>
       <w:r>
         <w:rPr>
+          <w:rFonts w:ascii="Arial" w:hAnsi="Arial"/>
           <w:b/>
+          <w:sz w:val="20"/>
         </w:rPr>
         <w:t>"Analysis of Kinematics, Dynamics, and Optimal Kalman Filter State Estimation for Vision-Based Tracking in an Over-Actuated 8-Thruster 6-DOF Vectored AUV"</w:t>
-        <w:br/>
       </w:r>
-      <w:r/>
+    </w:p>
+    <w:p>
+      <w:pPr>
+        <w:spacing w:after="80" w:line="276" w:lineRule="auto"/>
+        <w:ind w:firstLine="567"/>
+        <w:jc w:val="both"/>
+      </w:pPr>
       <w:r>
         <w:rPr>
+          <w:rFonts w:ascii="Arial" w:hAnsi="Arial"/>
           <w:i/>
+          <w:sz w:val="20"/>
         </w:rPr>
         <w:t>(Analisis Kinematika, Dinamika, dan Estimasi Keadaan Optimal Kalman Filter untuk Pelacakan Berbasis Visi pada AUV Vectored 6-DOF Over-Actuated 8-Pendorong)</w:t>
-        <w:br/>
       </w:r>
+    </w:p>
+    <w:p>
+      <w:pPr>
+        <w:spacing w:after="80" w:line="276" w:lineRule="auto"/>
+        <w:ind w:firstLine="567"/>
+        <w:jc w:val="both"/>
+      </w:pPr>
       <w:r>
+        <w:rPr>
+          <w:rFonts w:ascii="Arial" w:hAnsi="Arial"/>
+          <w:sz w:val="20"/>
+        </w:rPr>
         <w:t>Author: Radhi Shafeeq — Hasanuddin University (Mechatronics Engineering)</w:t>
       </w:r>
-      <w:r/>
-      <w:r/>
     </w:p>
     <w:p>
-      <w:r/>
+      <w:pPr>
+        <w:spacing w:after="80"/>
+        <w:ind w:left="680"/>
+      </w:pPr>
       <w:r>
+        <w:rPr>
+          <w:rFonts w:ascii="Arial" w:hAnsi="Arial"/>
+          <w:i/>
+          <w:sz w:val="19"/>
+        </w:rPr>
         <w:t>[!IMPORTANT]</w:t>
       </w:r>
+    </w:p>
+    <w:p>
+      <w:pPr>
+        <w:spacing w:after="80"/>
+        <w:ind w:left="680"/>
+      </w:pPr>
       <w:r>
         <w:rPr>
+          <w:rFonts w:ascii="Arial" w:hAnsi="Arial"/>
           <w:b/>
+          <w:i/>
+          <w:sz w:val="19"/>
         </w:rPr>
         <w:t>Strict Alphabetical Ordering &amp; $$\ge 2021$$ Publication Rule</w:t>
       </w:r>
       <w:r>
-        <w:t xml:space="preserve">: All entries are strictly arranged in </w:t>
+        <w:rPr>
+          <w:rFonts w:ascii="Arial" w:hAnsi="Arial"/>
+          <w:i/>
+          <w:sz w:val="19"/>
+        </w:rPr>
+        <w:t>:</w:t>
+      </w:r>
+    </w:p>
+    <w:p>
+      <w:pPr>
+        <w:spacing w:after="80"/>
+        <w:ind w:left="680"/>
+      </w:pPr>
+      <w:r>
+        <w:rPr>
+          <w:rFonts w:ascii="Arial" w:hAnsi="Arial"/>
+          <w:i/>
+          <w:sz w:val="19"/>
+        </w:rPr>
+        <w:t xml:space="preserve">All entries are strictly arranged in </w:t>
       </w:r>
       <w:r>
         <w:rPr>
+          <w:rFonts w:ascii="Arial" w:hAnsi="Arial"/>
           <w:b/>
+          <w:i/>
+          <w:sz w:val="19"/>
         </w:rPr>
         <w:t>alphabetical order (A–Z)</w:t>
       </w:r>
       <w:r>
+        <w:rPr>
+          <w:rFonts w:ascii="Arial" w:hAnsi="Arial"/>
+          <w:i/>
+          <w:sz w:val="19"/>
+        </w:rPr>
         <w:t xml:space="preserve"> by the primary author's surname or institutional organization, and are published strictly in </w:t>
       </w:r>
       <w:r>
         <w:rPr>
+          <w:rFonts w:ascii="Arial" w:hAnsi="Arial"/>
           <w:b/>
+          <w:i/>
+          <w:sz w:val="19"/>
         </w:rPr>
         <w:t>2021 or newer</w:t>
       </w:r>
       <w:r>
+        <w:rPr>
+          <w:rFonts w:ascii="Arial" w:hAnsi="Arial"/>
+          <w:i/>
+          <w:sz w:val="19"/>
+        </w:rPr>
         <w:t xml:space="preserve"> (2021–2026). Each index </w:t>
       </w:r>
       <w:r>
         <w:rPr>
-          <w:rFonts w:ascii="Courier" w:hAnsi="Courier"/>
+          <w:rFonts w:ascii="Arial" w:hAnsi="Arial"/>
+          <w:i/>
+          <w:sz w:val="19"/>
         </w:rPr>
         <w:t>[#]</w:t>
       </w:r>
       <w:r>
+        <w:rPr>
+          <w:rFonts w:ascii="Arial" w:hAnsi="Arial"/>
+          <w:i/>
+          <w:sz w:val="19"/>
+        </w:rPr>
         <w:t xml:space="preserve"> is fixed and globally synchronized across all thesis chapters.</w:t>
       </w:r>
-      <w:r/>
-      <w:r/>
     </w:p>
     <w:p>
       <w:pPr>
-        <w:pBdr>
-          <w:bottom w:val="single" w:sz="6" w:space="1" w:color="auto"/>
-        </w:pBdr>
+        <w:spacing w:before="160" w:after="40"/>
       </w:pPr>
-      <w:r/>
+      <w:r>
+        <w:rPr>
+          <w:rFonts w:ascii="Arial" w:hAnsi="Arial"/>
+          <w:b/>
+          <w:sz w:val="20"/>
+        </w:rPr>
+        <w:t>Global Synchronized Alphabetical Citation Index (</w:t>
+      </w:r>
+      <w:r>
+        <w:rPr>
+          <w:rFonts w:ascii="Arial" w:hAnsi="Arial"/>
+          <w:b/>
+          <w:sz w:val="20"/>
+        </w:rPr>
+        <w:t>$$\ge 2021$$</w:t>
+      </w:r>
+      <w:r>
+        <w:rPr>
+          <w:rFonts w:ascii="Arial" w:hAnsi="Arial"/>
+          <w:b/>
+          <w:sz w:val="20"/>
+        </w:rPr>
+        <w:t>)</w:t>
+      </w:r>
     </w:p>
     <w:p>
       <w:pPr>
-        <w:pStyle w:val="Heading3"/>
+        <w:spacing w:after="60"/>
+        <w:ind w:left="567" w:hanging="283"/>
       </w:pPr>
       <w:r>
-        <w:t>Global Synchronized Alphabetical Citation Index ($$\ge 2021$$)</w:t>
+        <w:rPr>
+          <w:rFonts w:ascii="Arial" w:hAnsi="Arial"/>
+        </w:rPr>
+        <w:t xml:space="preserve">•  </w:t>
       </w:r>
-      <w:r/>
-      <w:r/>
-    </w:p>
-    <w:p>
-      <w:pPr>
-        <w:pStyle w:val="ListBullet"/>
-        <w:spacing w:line="240" w:lineRule="auto"/>
-        <w:ind w:left="720"/>
-      </w:pPr>
-      <w:r/>
       <w:r>
         <w:rPr>
+          <w:rFonts w:ascii="Arial" w:hAnsi="Arial"/>
           <w:b/>
+          <w:sz w:val="20"/>
         </w:rPr>
         <w:t>[1]</w:t>
       </w:r>
       <w:r>
+        <w:rPr>
+          <w:rFonts w:ascii="Arial" w:hAnsi="Arial"/>
+          <w:sz w:val="20"/>
+        </w:rPr>
         <w:t xml:space="preserve"> Ahmed, F., Xiang, X., Jiang, C., &amp; Wang, Y. (2023). </w:t>
       </w:r>
       <w:r>
         <w:rPr>
+          <w:rFonts w:ascii="Arial" w:hAnsi="Arial"/>
           <w:i/>
+          <w:sz w:val="20"/>
         </w:rPr>
         <w:t>Survey on Traditional and AI-Based Estimation Techniques for Hydrodynamic Coefficients of Autonomous Underwater Vehicle</w:t>
       </w:r>
       <w:r>
+        <w:rPr>
+          <w:rFonts w:ascii="Arial" w:hAnsi="Arial"/>
+          <w:sz w:val="20"/>
+        </w:rPr>
         <w:t>. Ocean Engineering, 268, 113300. https://doi.org/10.1016/j.oceaneng.2023.113300</w:t>
       </w:r>
-      <w:r/>
     </w:p>
     <w:p>
       <w:pPr>
-        <w:pStyle w:val="ListBullet"/>
-        <w:spacing w:line="240" w:lineRule="auto"/>
-        <w:ind w:left="720"/>
+        <w:spacing w:after="60"/>
+        <w:ind w:left="567" w:hanging="283"/>
       </w:pPr>
-      <w:r/>
       <w:r>
         <w:rPr>
+          <w:rFonts w:ascii="Arial" w:hAnsi="Arial"/>
+        </w:rPr>
+        <w:t xml:space="preserve">•  </w:t>
+      </w:r>
+      <w:r>
+        <w:rPr>
+          <w:rFonts w:ascii="Arial" w:hAnsi="Arial"/>
           <w:b/>
+          <w:sz w:val="20"/>
         </w:rPr>
         <w:t>[2]</w:t>
       </w:r>
       <w:r>
+        <w:rPr>
+          <w:rFonts w:ascii="Arial" w:hAnsi="Arial"/>
+          <w:sz w:val="20"/>
+        </w:rPr>
         <w:t xml:space="preserve"> Alinei-Poiană, T., Rețe, D., Martinovici, D., Maer, V. M., &amp; Bușoniu, L. (2024). </w:t>
       </w:r>
       <w:r>
         <w:rPr>
+          <w:rFonts w:ascii="Arial" w:hAnsi="Arial"/>
           <w:i/>
+          <w:sz w:val="20"/>
         </w:rPr>
         <w:t>A BlueROV2-Based Platform for Underwater Mapping Experiments</w:t>
       </w:r>
       <w:r>
+        <w:rPr>
+          <w:rFonts w:ascii="Arial" w:hAnsi="Arial"/>
+          <w:sz w:val="20"/>
+        </w:rPr>
         <w:t>. IFAC-PapersOnLine, 58(20), 470–475. https://doi.org/10.1016/j.ifacol.2024.10.098</w:t>
       </w:r>
-      <w:r/>
     </w:p>
     <w:p>
       <w:pPr>
-        <w:pStyle w:val="ListBullet"/>
-        <w:spacing w:line="240" w:lineRule="auto"/>
-        <w:ind w:left="720"/>
+        <w:spacing w:after="60"/>
+        <w:ind w:left="567" w:hanging="283"/>
       </w:pPr>
-      <w:r/>
       <w:r>
         <w:rPr>
+          <w:rFonts w:ascii="Arial" w:hAnsi="Arial"/>
+        </w:rPr>
+        <w:t xml:space="preserve">•  </w:t>
+      </w:r>
+      <w:r>
+        <w:rPr>
+          <w:rFonts w:ascii="Arial" w:hAnsi="Arial"/>
           <w:b/>
+          <w:sz w:val="20"/>
         </w:rPr>
         <w:t>[3]</w:t>
       </w:r>
       <w:r>
+        <w:rPr>
+          <w:rFonts w:ascii="Arial" w:hAnsi="Arial"/>
+          <w:sz w:val="20"/>
+        </w:rPr>
         <w:t xml:space="preserve"> Blue Robotics (2024). </w:t>
       </w:r>
       <w:r>
         <w:rPr>
+          <w:rFonts w:ascii="Arial" w:hAnsi="Arial"/>
           <w:i/>
+          <w:sz w:val="20"/>
         </w:rPr>
         <w:t>BlueROV2 Heavy Configuration Retrofit Operating Guide and Technical Specifications</w:t>
       </w:r>
       <w:r>
+        <w:rPr>
+          <w:rFonts w:ascii="Arial" w:hAnsi="Arial"/>
+          <w:sz w:val="20"/>
+        </w:rPr>
         <w:t>. Blue Robotics Inc., Torrance, CA, USA.</w:t>
       </w:r>
-      <w:r/>
     </w:p>
     <w:p>
       <w:pPr>
-        <w:pStyle w:val="ListBullet"/>
-        <w:spacing w:line="240" w:lineRule="auto"/>
-        <w:ind w:left="720"/>
+        <w:spacing w:after="60"/>
+        <w:ind w:left="567" w:hanging="283"/>
       </w:pPr>
-      <w:r/>
       <w:r>
         <w:rPr>
+          <w:rFonts w:ascii="Arial" w:hAnsi="Arial"/>
+        </w:rPr>
+        <w:t xml:space="preserve">•  </w:t>
+      </w:r>
+      <w:r>
+        <w:rPr>
+          <w:rFonts w:ascii="Arial" w:hAnsi="Arial"/>
           <w:b/>
+          <w:sz w:val="20"/>
         </w:rPr>
         <w:t>[4]</w:t>
       </w:r>
       <w:r>
+        <w:rPr>
+          <w:rFonts w:ascii="Arial" w:hAnsi="Arial"/>
+          <w:sz w:val="20"/>
+        </w:rPr>
         <w:t xml:space="preserve"> de Moraes, C. C., Faltinsen, O. M., Esperança, P. T. T., Sphaier, S. H., &amp; Lugni, C. (2025). </w:t>
       </w:r>
       <w:r>
         <w:rPr>
+          <w:rFonts w:ascii="Arial" w:hAnsi="Arial"/>
           <w:i/>
+          <w:sz w:val="20"/>
         </w:rPr>
         <w:t>Free-Surface Interaction of a Fully Appendaged AUV: An Experimental Study Using the Planar Motion Mechanism Method for Calculating Hydrodynamic Coefficients</w:t>
       </w:r>
       <w:r>
+        <w:rPr>
+          <w:rFonts w:ascii="Arial" w:hAnsi="Arial"/>
+          <w:sz w:val="20"/>
+        </w:rPr>
         <w:t>. Ocean Engineering, 324, 120562. https://doi.org/10.1016/j.oceaneng.2025.120562</w:t>
       </w:r>
-      <w:r/>
     </w:p>
     <w:p>
       <w:pPr>
-        <w:pStyle w:val="ListBullet"/>
-        <w:spacing w:line="240" w:lineRule="auto"/>
-        <w:ind w:left="720"/>
+        <w:spacing w:after="60"/>
+        <w:ind w:left="567" w:hanging="283"/>
       </w:pPr>
-      <w:r/>
       <w:r>
         <w:rPr>
+          <w:rFonts w:ascii="Arial" w:hAnsi="Arial"/>
+        </w:rPr>
+        <w:t xml:space="preserve">•  </w:t>
+      </w:r>
+      <w:r>
+        <w:rPr>
+          <w:rFonts w:ascii="Arial" w:hAnsi="Arial"/>
           <w:b/>
+          <w:sz w:val="20"/>
         </w:rPr>
         <w:t>[5]</w:t>
       </w:r>
       <w:r>
+        <w:rPr>
+          <w:rFonts w:ascii="Arial" w:hAnsi="Arial"/>
+          <w:sz w:val="20"/>
+        </w:rPr>
         <w:t xml:space="preserve"> Det Norske Veritas (DNV) (2021). </w:t>
       </w:r>
       <w:r>
         <w:rPr>
+          <w:rFonts w:ascii="Arial" w:hAnsi="Arial"/>
           <w:i/>
+          <w:sz w:val="20"/>
         </w:rPr>
         <w:t>Environmental Conditions and Environmental Loads / Modelling and Analysis of Marine Operations</w:t>
       </w:r>
       <w:r>
+        <w:rPr>
+          <w:rFonts w:ascii="Arial" w:hAnsi="Arial"/>
+          <w:sz w:val="20"/>
+        </w:rPr>
         <w:t>. Recommended Practice DNVGL-RP-N103, Oslo, Norway.</w:t>
       </w:r>
-      <w:r/>
     </w:p>
     <w:p>
       <w:pPr>
-        <w:pStyle w:val="ListBullet"/>
-        <w:spacing w:line="240" w:lineRule="auto"/>
-        <w:ind w:left="720"/>
+        <w:spacing w:after="60"/>
+        <w:ind w:left="567" w:hanging="283"/>
       </w:pPr>
-      <w:r/>
       <w:r>
         <w:rPr>
+          <w:rFonts w:ascii="Arial" w:hAnsi="Arial"/>
+        </w:rPr>
+        <w:t xml:space="preserve">•  </w:t>
+      </w:r>
+      <w:r>
+        <w:rPr>
+          <w:rFonts w:ascii="Arial" w:hAnsi="Arial"/>
           <w:b/>
+          <w:sz w:val="20"/>
         </w:rPr>
         <w:t>[6]</w:t>
       </w:r>
       <w:r>
+        <w:rPr>
+          <w:rFonts w:ascii="Arial" w:hAnsi="Arial"/>
+          <w:sz w:val="20"/>
+        </w:rPr>
         <w:t xml:space="preserve"> Fan, Y., Dong, H., Zhao, X., &amp; Denissenko, P. (2024). </w:t>
       </w:r>
       <w:r>
         <w:rPr>
+          <w:rFonts w:ascii="Arial" w:hAnsi="Arial"/>
           <w:i/>
+          <w:sz w:val="20"/>
         </w:rPr>
         <w:t>Path-Following Control of Unmanned Underwater Vehicle Based on an Improved TD3 Deep Reinforcement Learning</w:t>
       </w:r>
       <w:r>
+        <w:rPr>
+          <w:rFonts w:ascii="Arial" w:hAnsi="Arial"/>
+          <w:sz w:val="20"/>
+        </w:rPr>
         <w:t>. IEEE Transactions on Control Systems Technology, 32(5), 1904–1919. https://doi.org/10.1109/TCST.2024.3382741</w:t>
       </w:r>
-      <w:r/>
     </w:p>
     <w:p>
       <w:pPr>
-        <w:pStyle w:val="ListBullet"/>
-        <w:spacing w:line="240" w:lineRule="auto"/>
-        <w:ind w:left="720"/>
+        <w:spacing w:after="60"/>
+        <w:ind w:left="567" w:hanging="283"/>
       </w:pPr>
-      <w:r/>
       <w:r>
         <w:rPr>
+          <w:rFonts w:ascii="Arial" w:hAnsi="Arial"/>
+        </w:rPr>
+        <w:t xml:space="preserve">•  </w:t>
+      </w:r>
+      <w:r>
+        <w:rPr>
+          <w:rFonts w:ascii="Arial" w:hAnsi="Arial"/>
           <w:b/>
+          <w:sz w:val="20"/>
         </w:rPr>
         <w:t>[7]</w:t>
       </w:r>
       <w:r>
+        <w:rPr>
+          <w:rFonts w:ascii="Arial" w:hAnsi="Arial"/>
+          <w:sz w:val="20"/>
+        </w:rPr>
         <w:t xml:space="preserve"> Fossen, T. I. (2021). </w:t>
       </w:r>
       <w:r>
         <w:rPr>
+          <w:rFonts w:ascii="Arial" w:hAnsi="Arial"/>
           <w:i/>
+          <w:sz w:val="20"/>
         </w:rPr>
         <w:t>Handbook of Marine Craft Hydrodynamics and Motion Control</w:t>
       </w:r>
       <w:r>
+        <w:rPr>
+          <w:rFonts w:ascii="Arial" w:hAnsi="Arial"/>
+          <w:sz w:val="20"/>
+        </w:rPr>
         <w:t>. John Wiley &amp; Sons, 2nd Edition, Hoboken, NJ, USA.</w:t>
       </w:r>
-      <w:r/>
     </w:p>
     <w:p>
       <w:pPr>
-        <w:pStyle w:val="ListBullet"/>
-        <w:spacing w:line="240" w:lineRule="auto"/>
-        <w:ind w:left="720"/>
+        <w:spacing w:after="60"/>
+        <w:ind w:left="567" w:hanging="283"/>
       </w:pPr>
-      <w:r/>
       <w:r>
         <w:rPr>
+          <w:rFonts w:ascii="Arial" w:hAnsi="Arial"/>
+        </w:rPr>
+        <w:t xml:space="preserve">•  </w:t>
+      </w:r>
+      <w:r>
+        <w:rPr>
+          <w:rFonts w:ascii="Arial" w:hAnsi="Arial"/>
           <w:b/>
+          <w:sz w:val="20"/>
         </w:rPr>
         <w:t>[8]</w:t>
       </w:r>
       <w:r>
+        <w:rPr>
+          <w:rFonts w:ascii="Arial" w:hAnsi="Arial"/>
+          <w:sz w:val="20"/>
+        </w:rPr>
         <w:t xml:space="preserve"> Franchi, M., Ridolfi, A., &amp; Allotta, B. (2022). </w:t>
       </w:r>
       <w:r>
         <w:rPr>
+          <w:rFonts w:ascii="Arial" w:hAnsi="Arial"/>
           <w:i/>
+          <w:sz w:val="20"/>
         </w:rPr>
         <w:t>Tethered Multi-Robot Systems in Marine Environments: A Review</w:t>
       </w:r>
       <w:r>
+        <w:rPr>
+          <w:rFonts w:ascii="Arial" w:hAnsi="Arial"/>
+          <w:sz w:val="20"/>
+        </w:rPr>
         <w:t>. Current Robotics Reports, 3(4), 229–239. https://doi.org/10.1007/s43154-022-00091-x</w:t>
       </w:r>
-      <w:r/>
     </w:p>
     <w:p>
       <w:pPr>
-        <w:pStyle w:val="ListBullet"/>
-        <w:spacing w:line="240" w:lineRule="auto"/>
-        <w:ind w:left="720"/>
+        <w:spacing w:after="60"/>
+        <w:ind w:left="567" w:hanging="283"/>
       </w:pPr>
-      <w:r/>
       <w:r>
         <w:rPr>
+          <w:rFonts w:ascii="Arial" w:hAnsi="Arial"/>
+        </w:rPr>
+        <w:t xml:space="preserve">•  </w:t>
+      </w:r>
+      <w:r>
+        <w:rPr>
+          <w:rFonts w:ascii="Arial" w:hAnsi="Arial"/>
           <w:b/>
+          <w:sz w:val="20"/>
         </w:rPr>
         <w:t>[9]</w:t>
       </w:r>
       <w:r>
+        <w:rPr>
+          <w:rFonts w:ascii="Arial" w:hAnsi="Arial"/>
+          <w:sz w:val="20"/>
+        </w:rPr>
         <w:t xml:space="preserve"> Gaggero, P., Corradini, F., &amp; Fossen, T. I. (2024). </w:t>
       </w:r>
       <w:r>
         <w:rPr>
+          <w:rFonts w:ascii="Arial" w:hAnsi="Arial"/>
           <w:i/>
+          <w:sz w:val="20"/>
         </w:rPr>
         <w:t>Tracking Data of a Remotely Operated Vehicle and Its Tether Using a Motion Capture System and a Tension Sensor</w:t>
       </w:r>
       <w:r>
+        <w:rPr>
+          <w:rFonts w:ascii="Arial" w:hAnsi="Arial"/>
+          <w:sz w:val="20"/>
+        </w:rPr>
         <w:t>. Scientific Data, 11, 482. https://doi.org/10.1038/s41597-024-03297-7</w:t>
       </w:r>
-      <w:r/>
     </w:p>
     <w:p>
       <w:pPr>
-        <w:pStyle w:val="ListBullet"/>
-        <w:spacing w:line="240" w:lineRule="auto"/>
-        <w:ind w:left="720"/>
+        <w:spacing w:after="60"/>
+        <w:ind w:left="567" w:hanging="283"/>
       </w:pPr>
-      <w:r/>
       <w:r>
         <w:rPr>
+          <w:rFonts w:ascii="Arial" w:hAnsi="Arial"/>
+        </w:rPr>
+        <w:t xml:space="preserve">•  </w:t>
+      </w:r>
+      <w:r>
+        <w:rPr>
+          <w:rFonts w:ascii="Arial" w:hAnsi="Arial"/>
           <w:b/>
+          <w:sz w:val="20"/>
         </w:rPr>
         <w:t>[10]</w:t>
       </w:r>
       <w:r>
+        <w:rPr>
+          <w:rFonts w:ascii="Arial" w:hAnsi="Arial"/>
+          <w:sz w:val="20"/>
+        </w:rPr>
         <w:t xml:space="preserve"> Ge, Z., Yang, F., Lu, W., Wei, P., Ying, Y., &amp; Peng, C. (2025). </w:t>
       </w:r>
       <w:r>
         <w:rPr>
+          <w:rFonts w:ascii="Arial" w:hAnsi="Arial"/>
           <w:i/>
+          <w:sz w:val="20"/>
         </w:rPr>
         <w:t>A Navigation System for ROV's Inspection on Fish Net Cage</w:t>
       </w:r>
       <w:r>
+        <w:rPr>
+          <w:rFonts w:ascii="Arial" w:hAnsi="Arial"/>
+          <w:sz w:val="20"/>
+        </w:rPr>
         <w:t>. IFAC-PapersOnLine, arXiv:2503.00482.</w:t>
       </w:r>
-      <w:r/>
     </w:p>
     <w:p>
       <w:pPr>
-        <w:pStyle w:val="ListBullet"/>
-        <w:spacing w:line="240" w:lineRule="auto"/>
-        <w:ind w:left="720"/>
+        <w:spacing w:after="60"/>
+        <w:ind w:left="567" w:hanging="283"/>
       </w:pPr>
-      <w:r/>
       <w:r>
         <w:rPr>
+          <w:rFonts w:ascii="Arial" w:hAnsi="Arial"/>
+        </w:rPr>
+        <w:t xml:space="preserve">•  </w:t>
+      </w:r>
+      <w:r>
+        <w:rPr>
+          <w:rFonts w:ascii="Arial" w:hAnsi="Arial"/>
           <w:b/>
+          <w:sz w:val="20"/>
         </w:rPr>
         <w:t>[11]</w:t>
       </w:r>
       <w:r>
+        <w:rPr>
+          <w:rFonts w:ascii="Arial" w:hAnsi="Arial"/>
+          <w:sz w:val="20"/>
+        </w:rPr>
         <w:t xml:space="preserve"> Gieraths, M., Kuchelmeister, F., &amp; Albiez, J. (2023). </w:t>
       </w:r>
       <w:r>
         <w:rPr>
+          <w:rFonts w:ascii="Arial" w:hAnsi="Arial"/>
           <w:i/>
+          <w:sz w:val="20"/>
         </w:rPr>
         <w:t>Modular Hardware Architecture for the Development of Underwater Vehicles Based on Systems Engineering</w:t>
       </w:r>
       <w:r>
+        <w:rPr>
+          <w:rFonts w:ascii="Arial" w:hAnsi="Arial"/>
+          <w:sz w:val="20"/>
+        </w:rPr>
         <w:t>. Sensors, 23(17), 7481. https://doi.org/10.3390/s23177481</w:t>
       </w:r>
-      <w:r/>
     </w:p>
     <w:p>
       <w:pPr>
-        <w:pStyle w:val="ListBullet"/>
-        <w:spacing w:line="240" w:lineRule="auto"/>
-        <w:ind w:left="720"/>
+        <w:spacing w:after="60"/>
+        <w:ind w:left="567" w:hanging="283"/>
       </w:pPr>
-      <w:r/>
       <w:r>
         <w:rPr>
+          <w:rFonts w:ascii="Arial" w:hAnsi="Arial"/>
+        </w:rPr>
+        <w:t xml:space="preserve">•  </w:t>
+      </w:r>
+      <w:r>
+        <w:rPr>
+          <w:rFonts w:ascii="Arial" w:hAnsi="Arial"/>
           <w:b/>
+          <w:sz w:val="20"/>
         </w:rPr>
         <w:t>[12]</w:t>
       </w:r>
       <w:r>
+        <w:rPr>
+          <w:rFonts w:ascii="Arial" w:hAnsi="Arial"/>
+          <w:sz w:val="20"/>
+        </w:rPr>
         <w:t xml:space="preserve"> Hong, L., Wang, X., &amp; Zhang, D. (2024). </w:t>
       </w:r>
       <w:r>
         <w:rPr>
+          <w:rFonts w:ascii="Arial" w:hAnsi="Arial"/>
           <w:i/>
+          <w:sz w:val="20"/>
         </w:rPr>
         <w:t>CFD-Based Hydrodynamic Performance Investigation of Autonomous Underwater Vehicles: A Survey</w:t>
       </w:r>
       <w:r>
+        <w:rPr>
+          <w:rFonts w:ascii="Arial" w:hAnsi="Arial"/>
+          <w:sz w:val="20"/>
+        </w:rPr>
         <w:t>. Ocean Engineering, 305, 117911. https://doi.org/10.1016/j.oceaneng.2024.117911</w:t>
       </w:r>
-      <w:r/>
     </w:p>
     <w:p>
       <w:pPr>
-        <w:pStyle w:val="ListBullet"/>
-        <w:spacing w:line="240" w:lineRule="auto"/>
-        <w:ind w:left="720"/>
+        <w:spacing w:after="60"/>
+        <w:ind w:left="567" w:hanging="283"/>
       </w:pPr>
-      <w:r/>
       <w:r>
         <w:rPr>
+          <w:rFonts w:ascii="Arial" w:hAnsi="Arial"/>
+        </w:rPr>
+        <w:t xml:space="preserve">•  </w:t>
+      </w:r>
+      <w:r>
+        <w:rPr>
+          <w:rFonts w:ascii="Arial" w:hAnsi="Arial"/>
           <w:b/>
+          <w:sz w:val="20"/>
         </w:rPr>
         <w:t>[13]</w:t>
       </w:r>
       <w:r>
+        <w:rPr>
+          <w:rFonts w:ascii="Arial" w:hAnsi="Arial"/>
+          <w:sz w:val="20"/>
+        </w:rPr>
         <w:t xml:space="preserve"> Huang, Z., Shen, Y., Du, Y., Yang, C., &amp; Wang, H. (2026). </w:t>
       </w:r>
       <w:r>
         <w:rPr>
+          <w:rFonts w:ascii="Arial" w:hAnsi="Arial"/>
           <w:i/>
+          <w:sz w:val="20"/>
         </w:rPr>
         <w:t>Event-Triggered Control for UUV Trajectory Tracking Based on Grey Wolf Optimized Disturbance Observation and Adaptive Sliding Mode</w:t>
       </w:r>
       <w:r>
+        <w:rPr>
+          <w:rFonts w:ascii="Arial" w:hAnsi="Arial"/>
+          <w:sz w:val="20"/>
+        </w:rPr>
         <w:t>. Ocean Engineering, 345, 123102. https://doi.org/10.1016/j.oceaneng.2026.123102</w:t>
       </w:r>
-      <w:r/>
     </w:p>
     <w:p>
       <w:pPr>
-        <w:pStyle w:val="ListBullet"/>
-        <w:spacing w:line="240" w:lineRule="auto"/>
-        <w:ind w:left="720"/>
+        <w:spacing w:after="60"/>
+        <w:ind w:left="567" w:hanging="283"/>
       </w:pPr>
-      <w:r/>
       <w:r>
         <w:rPr>
+          <w:rFonts w:ascii="Arial" w:hAnsi="Arial"/>
+        </w:rPr>
+        <w:t xml:space="preserve">•  </w:t>
+      </w:r>
+      <w:r>
+        <w:rPr>
+          <w:rFonts w:ascii="Arial" w:hAnsi="Arial"/>
           <w:b/>
+          <w:sz w:val="20"/>
         </w:rPr>
         <w:t>[14]</w:t>
       </w:r>
       <w:r>
+        <w:rPr>
+          <w:rFonts w:ascii="Arial" w:hAnsi="Arial"/>
+          <w:sz w:val="20"/>
+        </w:rPr>
         <w:t xml:space="preserve"> Ismail, W. M., Hassan, A. E., Abdelhady, N. M., Hassan, N. A., Maged, S. A., &amp; Abdulhasieb, H. M. (2021). </w:t>
       </w:r>
       <w:r>
         <w:rPr>
+          <w:rFonts w:ascii="Arial" w:hAnsi="Arial"/>
           <w:i/>
+          <w:sz w:val="20"/>
         </w:rPr>
         <w:t>Design of Affordable Hybrid Underwater Vehicle Platform Using ArduSub &amp; Robot Operating System (ROS) for Marine Robotics Research</w:t>
       </w:r>
       <w:r>
+        <w:rPr>
+          <w:rFonts w:ascii="Arial" w:hAnsi="Arial"/>
+          <w:sz w:val="20"/>
+        </w:rPr>
         <w:t>. In Proceedings of the 5th IUGRC International Undergraduate Research Conference, Cairo, Egypt, pp. 96–102.</w:t>
       </w:r>
-      <w:r/>
     </w:p>
     <w:p>
       <w:pPr>
-        <w:pStyle w:val="ListBullet"/>
-        <w:spacing w:line="240" w:lineRule="auto"/>
-        <w:ind w:left="720"/>
+        <w:spacing w:after="60"/>
+        <w:ind w:left="567" w:hanging="283"/>
       </w:pPr>
-      <w:r/>
       <w:r>
         <w:rPr>
+          <w:rFonts w:ascii="Arial" w:hAnsi="Arial"/>
+        </w:rPr>
+        <w:t xml:space="preserve">•  </w:t>
+      </w:r>
+      <w:r>
+        <w:rPr>
+          <w:rFonts w:ascii="Arial" w:hAnsi="Arial"/>
           <w:b/>
+          <w:sz w:val="20"/>
         </w:rPr>
         <w:t>[15]</w:t>
       </w:r>
       <w:r>
+        <w:rPr>
+          <w:rFonts w:ascii="Arial" w:hAnsi="Arial"/>
+          <w:sz w:val="20"/>
+        </w:rPr>
         <w:t xml:space="preserve"> Karras, A. A., Charalampous, K., &amp; Kyriakopoulos, K. J. (2024). </w:t>
       </w:r>
       <w:r>
         <w:rPr>
+          <w:rFonts w:ascii="Arial" w:hAnsi="Arial"/>
           <w:i/>
+          <w:sz w:val="20"/>
         </w:rPr>
         <w:t>From Virtual Waters to Real Oceans: A Simulation-Driven Approach to ROV Control System Design</w:t>
       </w:r>
       <w:r>
+        <w:rPr>
+          <w:rFonts w:ascii="Arial" w:hAnsi="Arial"/>
+          <w:sz w:val="20"/>
+        </w:rPr>
         <w:t>. Journal of Marine Science and Engineering, 12(11), 1957. https://doi.org/10.3390/jmse12111957</w:t>
       </w:r>
-      <w:r/>
     </w:p>
     <w:p>
       <w:pPr>
-        <w:pStyle w:val="ListBullet"/>
-        <w:spacing w:line="240" w:lineRule="auto"/>
-        <w:ind w:left="720"/>
+        <w:spacing w:after="60"/>
+        <w:ind w:left="567" w:hanging="283"/>
       </w:pPr>
-      <w:r/>
       <w:r>
         <w:rPr>
+          <w:rFonts w:ascii="Arial" w:hAnsi="Arial"/>
+        </w:rPr>
+        <w:t xml:space="preserve">•  </w:t>
+      </w:r>
+      <w:r>
+        <w:rPr>
+          <w:rFonts w:ascii="Arial" w:hAnsi="Arial"/>
           <w:b/>
+          <w:sz w:val="20"/>
         </w:rPr>
         <w:t>[16]</w:t>
       </w:r>
       <w:r>
+        <w:rPr>
+          <w:rFonts w:ascii="Arial" w:hAnsi="Arial"/>
+          <w:sz w:val="20"/>
+        </w:rPr>
         <w:t xml:space="preserve"> Khalid, A., Sarwat, A., &amp; Riggs, H. (Eds.). (2024). </w:t>
       </w:r>
       <w:r>
         <w:rPr>
+          <w:rFonts w:ascii="Arial" w:hAnsi="Arial"/>
           <w:i/>
+          <w:sz w:val="20"/>
         </w:rPr>
         <w:t>Applications and Optimizations of Kalman Filter and Their Variants</w:t>
       </w:r>
       <w:r>
+        <w:rPr>
+          <w:rFonts w:ascii="Arial" w:hAnsi="Arial"/>
+          <w:sz w:val="20"/>
+        </w:rPr>
         <w:t>. IntechOpen, London, UK. https://doi.org/10.5772/intechopen.109154</w:t>
       </w:r>
-      <w:r/>
     </w:p>
     <w:p>
       <w:pPr>
-        <w:pStyle w:val="ListBullet"/>
-        <w:spacing w:line="240" w:lineRule="auto"/>
-        <w:ind w:left="720"/>
+        <w:spacing w:after="60"/>
+        <w:ind w:left="567" w:hanging="283"/>
       </w:pPr>
-      <w:r/>
       <w:r>
         <w:rPr>
+          <w:rFonts w:ascii="Arial" w:hAnsi="Arial"/>
+        </w:rPr>
+        <w:t xml:space="preserve">•  </w:t>
+      </w:r>
+      <w:r>
+        <w:rPr>
+          <w:rFonts w:ascii="Arial" w:hAnsi="Arial"/>
           <w:b/>
+          <w:sz w:val="20"/>
         </w:rPr>
         <w:t>[17]</w:t>
       </w:r>
       <w:r>
+        <w:rPr>
+          <w:rFonts w:ascii="Arial" w:hAnsi="Arial"/>
+          <w:sz w:val="20"/>
+        </w:rPr>
         <w:t xml:space="preserve"> Kim, Y. V. (Ed.). (2023). </w:t>
       </w:r>
       <w:r>
         <w:rPr>
+          <w:rFonts w:ascii="Arial" w:hAnsi="Arial"/>
           <w:i/>
+          <w:sz w:val="20"/>
         </w:rPr>
         <w:t>Kalman Filter - Engineering Applications</w:t>
       </w:r>
       <w:r>
+        <w:rPr>
+          <w:rFonts w:ascii="Arial" w:hAnsi="Arial"/>
+          <w:sz w:val="20"/>
+        </w:rPr>
         <w:t>. IntechOpen, London, UK. https://doi.org/10.5772/intechopen.100722</w:t>
       </w:r>
-      <w:r/>
     </w:p>
     <w:p>
       <w:pPr>
-        <w:pStyle w:val="ListBullet"/>
-        <w:spacing w:line="240" w:lineRule="auto"/>
-        <w:ind w:left="720"/>
+        <w:spacing w:after="60"/>
+        <w:ind w:left="567" w:hanging="283"/>
       </w:pPr>
-      <w:r/>
       <w:r>
         <w:rPr>
+          <w:rFonts w:ascii="Arial" w:hAnsi="Arial"/>
+        </w:rPr>
+        <w:t xml:space="preserve">•  </w:t>
+      </w:r>
+      <w:r>
+        <w:rPr>
+          <w:rFonts w:ascii="Arial" w:hAnsi="Arial"/>
           <w:b/>
+          <w:sz w:val="20"/>
         </w:rPr>
         <w:t>[18]</w:t>
       </w:r>
       <w:r>
+        <w:rPr>
+          <w:rFonts w:ascii="Arial" w:hAnsi="Arial"/>
+          <w:sz w:val="20"/>
+        </w:rPr>
         <w:t xml:space="preserve"> Llorente-Vidrio, D., Chavez-Galaviz, J., Fuentes-Aguilar, R. Q., Chairez, I., &amp; Mahmoudian, N. (2025). </w:t>
       </w:r>
       <w:r>
         <w:rPr>
+          <w:rFonts w:ascii="Arial" w:hAnsi="Arial"/>
           <w:i/>
+          <w:sz w:val="20"/>
         </w:rPr>
         <w:t>Robust Sliding-Mode Control of an Underwater ROV via Neural Differential Identification of Model Uncertainties</w:t>
       </w:r>
       <w:r>
+        <w:rPr>
+          <w:rFonts w:ascii="Arial" w:hAnsi="Arial"/>
+          <w:sz w:val="20"/>
+        </w:rPr>
         <w:t>. Ocean Engineering, 341, 122728. https://doi.org/10.1016/j.oceaneng.2025.122728</w:t>
       </w:r>
-      <w:r/>
     </w:p>
     <w:p>
       <w:pPr>
-        <w:pStyle w:val="ListBullet"/>
-        <w:spacing w:line="240" w:lineRule="auto"/>
-        <w:ind w:left="720"/>
+        <w:spacing w:after="60"/>
+        <w:ind w:left="567" w:hanging="283"/>
       </w:pPr>
-      <w:r/>
       <w:r>
         <w:rPr>
+          <w:rFonts w:ascii="Arial" w:hAnsi="Arial"/>
+        </w:rPr>
+        <w:t xml:space="preserve">•  </w:t>
+      </w:r>
+      <w:r>
+        <w:rPr>
+          <w:rFonts w:ascii="Arial" w:hAnsi="Arial"/>
           <w:b/>
+          <w:sz w:val="20"/>
         </w:rPr>
         <w:t>[19]</w:t>
       </w:r>
       <w:r>
+        <w:rPr>
+          <w:rFonts w:ascii="Arial" w:hAnsi="Arial"/>
+          <w:sz w:val="20"/>
+        </w:rPr>
         <w:t xml:space="preserve"> Mari, Z., Nawaf, M. M., &amp; Drap, P. (2026). </w:t>
       </w:r>
       <w:r>
         <w:rPr>
+          <w:rFonts w:ascii="Arial" w:hAnsi="Arial"/>
           <w:i/>
+          <w:sz w:val="20"/>
         </w:rPr>
         <w:t>Deep Reinforcement Learning for Autonomous Underwater Navigation: A Comparative Study with DWA and Digital Twin Validation</w:t>
       </w:r>
       <w:r>
+        <w:rPr>
+          <w:rFonts w:ascii="Arial" w:hAnsi="Arial"/>
+          <w:sz w:val="20"/>
+        </w:rPr>
         <w:t>. Sensors, 26(2), 512. https://doi.org/10.3390/s26020512</w:t>
       </w:r>
-      <w:r/>
     </w:p>
     <w:p>
       <w:pPr>
-        <w:pStyle w:val="ListBullet"/>
-        <w:spacing w:line="240" w:lineRule="auto"/>
-        <w:ind w:left="720"/>
+        <w:spacing w:after="60"/>
+        <w:ind w:left="567" w:hanging="283"/>
       </w:pPr>
-      <w:r/>
       <w:r>
         <w:rPr>
+          <w:rFonts w:ascii="Arial" w:hAnsi="Arial"/>
+        </w:rPr>
+        <w:t xml:space="preserve">•  </w:t>
+      </w:r>
+      <w:r>
+        <w:rPr>
+          <w:rFonts w:ascii="Arial" w:hAnsi="Arial"/>
           <w:b/>
+          <w:sz w:val="20"/>
         </w:rPr>
         <w:t>[20]</w:t>
       </w:r>
       <w:r>
+        <w:rPr>
+          <w:rFonts w:ascii="Arial" w:hAnsi="Arial"/>
+          <w:sz w:val="20"/>
+        </w:rPr>
         <w:t xml:space="preserve"> McIvor, E., Sklivanitis, G., &amp; Pados, D. A. (2024). </w:t>
       </w:r>
       <w:r>
         <w:rPr>
+          <w:rFonts w:ascii="Arial" w:hAnsi="Arial"/>
           <w:i/>
+          <w:sz w:val="20"/>
         </w:rPr>
         <w:t>A Generalizable Entity-Component-System Architecture for Underwater ROV Control</w:t>
       </w:r>
       <w:r>
+        <w:rPr>
+          <w:rFonts w:ascii="Arial" w:hAnsi="Arial"/>
+          <w:sz w:val="20"/>
+        </w:rPr>
         <w:t>. In IEEE/OES OCEANS 2024 - Singapore, pp. 1–7. https://doi.org/10.1109/OCEANS51537.2024.10682121</w:t>
       </w:r>
-      <w:r/>
     </w:p>
     <w:p>
       <w:pPr>
-        <w:pStyle w:val="ListBullet"/>
-        <w:spacing w:line="240" w:lineRule="auto"/>
-        <w:ind w:left="720"/>
+        <w:spacing w:after="60"/>
+        <w:ind w:left="567" w:hanging="283"/>
       </w:pPr>
-      <w:r/>
       <w:r>
         <w:rPr>
+          <w:rFonts w:ascii="Arial" w:hAnsi="Arial"/>
+        </w:rPr>
+        <w:t xml:space="preserve">•  </w:t>
+      </w:r>
+      <w:r>
+        <w:rPr>
+          <w:rFonts w:ascii="Arial" w:hAnsi="Arial"/>
           <w:b/>
+          <w:sz w:val="20"/>
         </w:rPr>
         <w:t>[21]</w:t>
       </w:r>
       <w:r>
+        <w:rPr>
+          <w:rFonts w:ascii="Arial" w:hAnsi="Arial"/>
+          <w:sz w:val="20"/>
+        </w:rPr>
         <w:t xml:space="preserve"> Ng, P., &amp; Krieg, M. (2024). </w:t>
       </w:r>
       <w:r>
         <w:rPr>
+          <w:rFonts w:ascii="Arial" w:hAnsi="Arial"/>
           <w:i/>
+          <w:sz w:val="20"/>
         </w:rPr>
         <w:t>Modifications to ArduSub That Improve BlueROV SITL Accuracy and Design of Hybrid Autopilot</w:t>
       </w:r>
       <w:r>
+        <w:rPr>
+          <w:rFonts w:ascii="Arial" w:hAnsi="Arial"/>
+          <w:sz w:val="20"/>
+        </w:rPr>
         <w:t>. Applied Sciences, 14(17), 7453. https://doi.org/10.3390/app14177453</w:t>
       </w:r>
-      <w:r/>
     </w:p>
     <w:p>
       <w:pPr>
-        <w:pStyle w:val="ListBullet"/>
-        <w:spacing w:line="240" w:lineRule="auto"/>
-        <w:ind w:left="720"/>
+        <w:spacing w:after="60"/>
+        <w:ind w:left="567" w:hanging="283"/>
       </w:pPr>
-      <w:r/>
       <w:r>
         <w:rPr>
+          <w:rFonts w:ascii="Arial" w:hAnsi="Arial"/>
+        </w:rPr>
+        <w:t xml:space="preserve">•  </w:t>
+      </w:r>
+      <w:r>
+        <w:rPr>
+          <w:rFonts w:ascii="Arial" w:hAnsi="Arial"/>
           <w:b/>
+          <w:sz w:val="20"/>
         </w:rPr>
         <w:t>[22]</w:t>
       </w:r>
       <w:r>
+        <w:rPr>
+          <w:rFonts w:ascii="Arial" w:hAnsi="Arial"/>
+          <w:sz w:val="20"/>
+        </w:rPr>
         <w:t xml:space="preserve"> Pandian, R. S., Sakthivel, P., &amp; Palanisamy, V. (2023). </w:t>
       </w:r>
       <w:r>
         <w:rPr>
+          <w:rFonts w:ascii="Arial" w:hAnsi="Arial"/>
           <w:i/>
+          <w:sz w:val="20"/>
         </w:rPr>
         <w:t>Path Planning and Obstacle Avoidance for AUV: A Review</w:t>
       </w:r>
       <w:r>
+        <w:rPr>
+          <w:rFonts w:ascii="Arial" w:hAnsi="Arial"/>
+          <w:sz w:val="20"/>
+        </w:rPr>
         <w:t>. Ocean Engineering, 285, 115456. https://doi.org/10.1016/j.oceaneng.2023.115456</w:t>
       </w:r>
-      <w:r/>
     </w:p>
     <w:p>
       <w:pPr>
-        <w:pStyle w:val="ListBullet"/>
-        <w:spacing w:line="240" w:lineRule="auto"/>
-        <w:ind w:left="720"/>
+        <w:spacing w:after="60"/>
+        <w:ind w:left="567" w:hanging="283"/>
       </w:pPr>
-      <w:r/>
       <w:r>
         <w:rPr>
+          <w:rFonts w:ascii="Arial" w:hAnsi="Arial"/>
+        </w:rPr>
+        <w:t xml:space="preserve">•  </w:t>
+      </w:r>
+      <w:r>
+        <w:rPr>
+          <w:rFonts w:ascii="Arial" w:hAnsi="Arial"/>
           <w:b/>
+          <w:sz w:val="20"/>
         </w:rPr>
         <w:t>[23]</w:t>
       </w:r>
       <w:r>
+        <w:rPr>
+          <w:rFonts w:ascii="Arial" w:hAnsi="Arial"/>
+          <w:sz w:val="20"/>
+        </w:rPr>
         <w:t xml:space="preserve"> Rusu, C., Radu, V., &amp; Costanzi, R. (2023). </w:t>
       </w:r>
       <w:r>
         <w:rPr>
+          <w:rFonts w:ascii="Arial" w:hAnsi="Arial"/>
           <w:i/>
+          <w:sz w:val="20"/>
         </w:rPr>
         <w:t>Small Modular AUV Based on 3D Printing Technology: Design, Implementation and Experimental Validation</w:t>
       </w:r>
       <w:r>
+        <w:rPr>
+          <w:rFonts w:ascii="Arial" w:hAnsi="Arial"/>
+          <w:sz w:val="20"/>
+        </w:rPr>
         <w:t>. Sensors, 23(14), 6331. https://doi.org/10.3390/s23146331</w:t>
       </w:r>
-      <w:r/>
     </w:p>
     <w:p>
       <w:pPr>
-        <w:pStyle w:val="ListBullet"/>
-        <w:spacing w:line="240" w:lineRule="auto"/>
-        <w:ind w:left="720"/>
+        <w:spacing w:after="60"/>
+        <w:ind w:left="567" w:hanging="283"/>
       </w:pPr>
-      <w:r/>
       <w:r>
         <w:rPr>
+          <w:rFonts w:ascii="Arial" w:hAnsi="Arial"/>
+        </w:rPr>
+        <w:t xml:space="preserve">•  </w:t>
+      </w:r>
+      <w:r>
+        <w:rPr>
+          <w:rFonts w:ascii="Arial" w:hAnsi="Arial"/>
           <w:b/>
+          <w:sz w:val="20"/>
         </w:rPr>
         <w:t>[24]</w:t>
       </w:r>
       <w:r>
+        <w:rPr>
+          <w:rFonts w:ascii="Arial" w:hAnsi="Arial"/>
+          <w:sz w:val="20"/>
+        </w:rPr>
         <w:t xml:space="preserve"> Saad, A., Akram, W., &amp; Hussain, I. (2026). </w:t>
       </w:r>
       <w:r>
         <w:rPr>
+          <w:rFonts w:ascii="Arial" w:hAnsi="Arial"/>
           <w:i/>
+          <w:sz w:val="20"/>
         </w:rPr>
         <w:t>AquaChat++: LLM-Assisted Multi-ROV Inspection for Aquaculture Net Pens with Integrated Battery Management and Thruster Fault Tolerance</w:t>
       </w:r>
       <w:r>
+        <w:rPr>
+          <w:rFonts w:ascii="Arial" w:hAnsi="Arial"/>
+          <w:sz w:val="20"/>
+        </w:rPr>
         <w:t>. Ocean Engineering, 343, 122950. https://doi.org/10.1016/j.oceaneng.2026.122950</w:t>
       </w:r>
-      <w:r/>
     </w:p>
     <w:p>
       <w:pPr>
-        <w:pStyle w:val="ListBullet"/>
-        <w:spacing w:line="240" w:lineRule="auto"/>
-        <w:ind w:left="720"/>
+        <w:spacing w:after="60"/>
+        <w:ind w:left="567" w:hanging="283"/>
       </w:pPr>
-      <w:r/>
       <w:r>
         <w:rPr>
+          <w:rFonts w:ascii="Arial" w:hAnsi="Arial"/>
+        </w:rPr>
+        <w:t xml:space="preserve">•  </w:t>
+      </w:r>
+      <w:r>
+        <w:rPr>
+          <w:rFonts w:ascii="Arial" w:hAnsi="Arial"/>
           <w:b/>
+          <w:sz w:val="20"/>
         </w:rPr>
         <w:t>[25]</w:t>
       </w:r>
       <w:r>
+        <w:rPr>
+          <w:rFonts w:ascii="Arial" w:hAnsi="Arial"/>
+          <w:sz w:val="20"/>
+        </w:rPr>
         <w:t xml:space="preserve"> Särkkä, S., &amp; Svensson, L. (2023). </w:t>
       </w:r>
       <w:r>
         <w:rPr>
+          <w:rFonts w:ascii="Arial" w:hAnsi="Arial"/>
           <w:i/>
+          <w:sz w:val="20"/>
         </w:rPr>
         <w:t>Bayesian Filtering and Smoothing</w:t>
       </w:r>
       <w:r>
+        <w:rPr>
+          <w:rFonts w:ascii="Arial" w:hAnsi="Arial"/>
+          <w:sz w:val="20"/>
+        </w:rPr>
         <w:t>. Cambridge University Press, 2nd Edition, Cambridge, UK. https://doi.org/10.1017/9781108910002</w:t>
       </w:r>
-      <w:r/>
     </w:p>
     <w:p>
       <w:pPr>
-        <w:pStyle w:val="ListBullet"/>
-        <w:spacing w:line="240" w:lineRule="auto"/>
-        <w:ind w:left="720"/>
+        <w:spacing w:after="60"/>
+        <w:ind w:left="567" w:hanging="283"/>
       </w:pPr>
-      <w:r/>
       <w:r>
         <w:rPr>
+          <w:rFonts w:ascii="Arial" w:hAnsi="Arial"/>
+        </w:rPr>
+        <w:t xml:space="preserve">•  </w:t>
+      </w:r>
+      <w:r>
+        <w:rPr>
+          <w:rFonts w:ascii="Arial" w:hAnsi="Arial"/>
           <w:b/>
+          <w:sz w:val="20"/>
         </w:rPr>
         <w:t>[26]</w:t>
       </w:r>
       <w:r>
+        <w:rPr>
+          <w:rFonts w:ascii="Arial" w:hAnsi="Arial"/>
+          <w:sz w:val="20"/>
+        </w:rPr>
         <w:t xml:space="preserve"> Song, P., Wei, Z., Zhang, J., &amp; Wang, X. (2023). </w:t>
       </w:r>
       <w:r>
         <w:rPr>
+          <w:rFonts w:ascii="Arial" w:hAnsi="Arial"/>
           <w:i/>
+          <w:sz w:val="20"/>
         </w:rPr>
         <w:t>Multi-Objective Shape Optimization of Autonomous Underwater Vehicle by Coupling CFD Simulation with Genetic Algorithm</w:t>
       </w:r>
       <w:r>
+        <w:rPr>
+          <w:rFonts w:ascii="Arial" w:hAnsi="Arial"/>
+          <w:sz w:val="20"/>
+        </w:rPr>
         <w:t>. Ocean Engineering, 280, 114686. https://doi.org/10.1016/j.oceaneng.2023.114686</w:t>
       </w:r>
-      <w:r/>
     </w:p>
     <w:p>
       <w:pPr>
-        <w:pStyle w:val="ListBullet"/>
-        <w:spacing w:line="240" w:lineRule="auto"/>
-        <w:ind w:left="720"/>
+        <w:spacing w:after="60"/>
+        <w:ind w:left="567" w:hanging="283"/>
       </w:pPr>
-      <w:r/>
       <w:r>
         <w:rPr>
+          <w:rFonts w:ascii="Arial" w:hAnsi="Arial"/>
+        </w:rPr>
+        <w:t xml:space="preserve">•  </w:t>
+      </w:r>
+      <w:r>
+        <w:rPr>
+          <w:rFonts w:ascii="Arial" w:hAnsi="Arial"/>
           <w:b/>
+          <w:sz w:val="20"/>
         </w:rPr>
         <w:t>[27]</w:t>
       </w:r>
       <w:r>
+        <w:rPr>
+          <w:rFonts w:ascii="Arial" w:hAnsi="Arial"/>
+          <w:sz w:val="20"/>
+        </w:rPr>
         <w:t xml:space="preserve"> Suárez, Á. E. Z., Palacios, F. M., Cruz, S. S., Leal, R. L., &amp; Zamora-Justo, J. A. (2024). </w:t>
       </w:r>
       <w:r>
         <w:rPr>
+          <w:rFonts w:ascii="Arial" w:hAnsi="Arial"/>
           <w:i/>
+          <w:sz w:val="20"/>
         </w:rPr>
         <w:t>Dynamic Modeling and Robust Control for Underwater Vehicles by Using Dual Quaternions</w:t>
       </w:r>
       <w:r>
+        <w:rPr>
+          <w:rFonts w:ascii="Arial" w:hAnsi="Arial"/>
+          <w:sz w:val="20"/>
+        </w:rPr>
         <w:t>. Ocean Engineering, 313, 119475. https://doi.org/10.1016/j.oceaneng.2024.119475</w:t>
       </w:r>
-      <w:r/>
     </w:p>
     <w:p>
       <w:pPr>
-        <w:pStyle w:val="ListBullet"/>
-        <w:spacing w:line="240" w:lineRule="auto"/>
-        <w:ind w:left="720"/>
+        <w:spacing w:after="60"/>
+        <w:ind w:left="567" w:hanging="283"/>
       </w:pPr>
-      <w:r/>
       <w:r>
         <w:rPr>
+          <w:rFonts w:ascii="Arial" w:hAnsi="Arial"/>
+        </w:rPr>
+        <w:t xml:space="preserve">•  </w:t>
+      </w:r>
+      <w:r>
+        <w:rPr>
+          <w:rFonts w:ascii="Arial" w:hAnsi="Arial"/>
           <w:b/>
+          <w:sz w:val="20"/>
         </w:rPr>
         <w:t>[28]</w:t>
       </w:r>
       <w:r>
+        <w:rPr>
+          <w:rFonts w:ascii="Arial" w:hAnsi="Arial"/>
+          <w:sz w:val="20"/>
+        </w:rPr>
         <w:t xml:space="preserve"> Sun, Y., Wang, X., Zhang, Y., &amp; Chen, G. (2022). </w:t>
       </w:r>
       <w:r>
         <w:rPr>
+          <w:rFonts w:ascii="Arial" w:hAnsi="Arial"/>
           <w:i/>
+          <w:sz w:val="20"/>
         </w:rPr>
         <w:t>Nonlinear Dynamics of Novel Flight-Style Autonomous Underwater Vehicle with Bow Wings, Part I: ASE and CFD Based Estimations of Hydrodynamic Coefficients; Part II: Nonlinear Dynamic Modeling and Experimental Validations</w:t>
       </w:r>
       <w:r>
+        <w:rPr>
+          <w:rFonts w:ascii="Arial" w:hAnsi="Arial"/>
+          <w:sz w:val="20"/>
+        </w:rPr>
         <w:t>. Ocean Engineering, 266, 112836. https://doi.org/10.1016/j.oceaneng.2022.112836</w:t>
       </w:r>
-      <w:r/>
     </w:p>
     <w:p>
       <w:pPr>
-        <w:pStyle w:val="ListBullet"/>
-        <w:spacing w:line="240" w:lineRule="auto"/>
-        <w:ind w:left="720"/>
+        <w:spacing w:after="60"/>
+        <w:ind w:left="567" w:hanging="283"/>
       </w:pPr>
-      <w:r/>
       <w:r>
         <w:rPr>
+          <w:rFonts w:ascii="Arial" w:hAnsi="Arial"/>
+        </w:rPr>
+        <w:t xml:space="preserve">•  </w:t>
+      </w:r>
+      <w:r>
+        <w:rPr>
+          <w:rFonts w:ascii="Arial" w:hAnsi="Arial"/>
           <w:b/>
+          <w:sz w:val="20"/>
         </w:rPr>
         <w:t>[29]</w:t>
       </w:r>
       <w:r>
+        <w:rPr>
+          <w:rFonts w:ascii="Arial" w:hAnsi="Arial"/>
+          <w:sz w:val="20"/>
+        </w:rPr>
         <w:t xml:space="preserve"> Ulin-Avila, E., &amp; Ponce-Hernandez, J. (2021). </w:t>
       </w:r>
       <w:r>
         <w:rPr>
+          <w:rFonts w:ascii="Arial" w:hAnsi="Arial"/>
           <w:i/>
+          <w:sz w:val="20"/>
         </w:rPr>
         <w:t>Kalman Filter Estimation and Its Implementation</w:t>
       </w:r>
       <w:r>
+        <w:rPr>
+          <w:rFonts w:ascii="Arial" w:hAnsi="Arial"/>
+          <w:sz w:val="20"/>
+        </w:rPr>
         <w:t xml:space="preserve">. In </w:t>
       </w:r>
       <w:r>
         <w:rPr>
+          <w:rFonts w:ascii="Arial" w:hAnsi="Arial"/>
           <w:i/>
+          <w:sz w:val="20"/>
         </w:rPr>
         <w:t>Adaptive Filtering - Recent Advances and Practical Implementation</w:t>
       </w:r>
       <w:r>
+        <w:rPr>
+          <w:rFonts w:ascii="Arial" w:hAnsi="Arial"/>
+          <w:sz w:val="20"/>
+        </w:rPr>
         <w:t>, IntechOpen, London, UK. https://doi.org/10.5772/intechopen.97406</w:t>
       </w:r>
-      <w:r/>
     </w:p>
     <w:p>
       <w:pPr>
-        <w:pStyle w:val="ListBullet"/>
-        <w:spacing w:line="240" w:lineRule="auto"/>
-        <w:ind w:left="720"/>
+        <w:spacing w:after="60"/>
+        <w:ind w:left="567" w:hanging="283"/>
       </w:pPr>
-      <w:r/>
       <w:r>
         <w:rPr>
+          <w:rFonts w:ascii="Arial" w:hAnsi="Arial"/>
+        </w:rPr>
+        <w:t xml:space="preserve">•  </w:t>
+      </w:r>
+      <w:r>
+        <w:rPr>
+          <w:rFonts w:ascii="Arial" w:hAnsi="Arial"/>
           <w:b/>
+          <w:sz w:val="20"/>
         </w:rPr>
         <w:t>[30]</w:t>
       </w:r>
       <w:r>
+        <w:rPr>
+          <w:rFonts w:ascii="Arial" w:hAnsi="Arial"/>
+          <w:sz w:val="20"/>
+        </w:rPr>
         <w:t xml:space="preserve"> Vögele, C., Schilling, M., &amp; Hildebrandt, M. (2022). </w:t>
       </w:r>
       <w:r>
         <w:rPr>
+          <w:rFonts w:ascii="Arial" w:hAnsi="Arial"/>
           <w:i/>
+          <w:sz w:val="20"/>
         </w:rPr>
         <w:t>Modularis: Modular Underwater Robot for Rapid Development and Validation of Autonomous Systems</w:t>
       </w:r>
       <w:r>
+        <w:rPr>
+          <w:rFonts w:ascii="Arial" w:hAnsi="Arial"/>
+          <w:sz w:val="20"/>
+        </w:rPr>
         <w:t>. In 2022 IEEE International Conference on Robotics and Biomimetics (ROBIO), pp. 2004–2010. https://doi.org/10.1109/ROBIO54168.2022.10011985</w:t>
       </w:r>
-      <w:r/>
     </w:p>
     <w:p>
       <w:pPr>
-        <w:pStyle w:val="ListBullet"/>
-        <w:spacing w:line="240" w:lineRule="auto"/>
-        <w:ind w:left="720"/>
+        <w:spacing w:after="60"/>
+        <w:ind w:left="567" w:hanging="283"/>
       </w:pPr>
-      <w:r/>
       <w:r>
         <w:rPr>
+          <w:rFonts w:ascii="Arial" w:hAnsi="Arial"/>
+        </w:rPr>
+        <w:t xml:space="preserve">•  </w:t>
+      </w:r>
+      <w:r>
+        <w:rPr>
+          <w:rFonts w:ascii="Arial" w:hAnsi="Arial"/>
           <w:b/>
+          <w:sz w:val="20"/>
         </w:rPr>
         <w:t>[31]</w:t>
       </w:r>
       <w:r>
+        <w:rPr>
+          <w:rFonts w:ascii="Arial" w:hAnsi="Arial"/>
+          <w:sz w:val="20"/>
+        </w:rPr>
         <w:t xml:space="preserve"> von Benzon, M., Sørensen, F. F., Uth, E., Jouffroy, J., Liniger, J., &amp; Pedersen, S. (2022). </w:t>
       </w:r>
       <w:r>
         <w:rPr>
+          <w:rFonts w:ascii="Arial" w:hAnsi="Arial"/>
           <w:i/>
+          <w:sz w:val="20"/>
         </w:rPr>
         <w:t>An Open-Source Benchmark Simulator: Control of a BlueROV2 Underwater Robot</w:t>
       </w:r>
       <w:r>
+        <w:rPr>
+          <w:rFonts w:ascii="Arial" w:hAnsi="Arial"/>
+          <w:sz w:val="20"/>
+        </w:rPr>
         <w:t>. Journal of Marine Science and Engineering, 10(12), 1898. https://doi.org/10.3390/jmse10121898</w:t>
       </w:r>
-      <w:r/>
     </w:p>
     <w:p>
       <w:pPr>
-        <w:pStyle w:val="ListBullet"/>
-        <w:spacing w:line="240" w:lineRule="auto"/>
-        <w:ind w:left="720"/>
+        <w:spacing w:after="60"/>
+        <w:ind w:left="567" w:hanging="283"/>
       </w:pPr>
-      <w:r/>
       <w:r>
         <w:rPr>
+          <w:rFonts w:ascii="Arial" w:hAnsi="Arial"/>
+        </w:rPr>
+        <w:t xml:space="preserve">•  </w:t>
+      </w:r>
+      <w:r>
+        <w:rPr>
+          <w:rFonts w:ascii="Arial" w:hAnsi="Arial"/>
           <w:b/>
+          <w:sz w:val="20"/>
         </w:rPr>
         <w:t>[32]</w:t>
       </w:r>
       <w:r>
+        <w:rPr>
+          <w:rFonts w:ascii="Arial" w:hAnsi="Arial"/>
+          <w:sz w:val="20"/>
+        </w:rPr>
         <w:t xml:space="preserve"> Vu, M. T., Le, T. H., Thanh, H. L. N. N., Huynh, T. T., Van, M., Hoang, Q. D., &amp; Do, T. D. (2021). </w:t>
       </w:r>
       <w:r>
         <w:rPr>
+          <w:rFonts w:ascii="Arial" w:hAnsi="Arial"/>
           <w:i/>
+          <w:sz w:val="20"/>
         </w:rPr>
         <w:t>Robust Position Control of an Over-Actuated Underwater Vehicle Under Model Uncertainties and Ocean Current Effects Using Dynamic Sliding Mode Surface and Optimal Allocation Control</w:t>
       </w:r>
       <w:r>
+        <w:rPr>
+          <w:rFonts w:ascii="Arial" w:hAnsi="Arial"/>
+          <w:sz w:val="20"/>
+        </w:rPr>
         <w:t>. Sensors, 21(3), 747. https://doi.org/10.3390/s21030747</w:t>
       </w:r>
-      <w:r/>
     </w:p>
     <w:p>
       <w:pPr>
-        <w:pStyle w:val="ListBullet"/>
-        <w:spacing w:line="240" w:lineRule="auto"/>
-        <w:ind w:left="720"/>
+        <w:spacing w:after="60"/>
+        <w:ind w:left="567" w:hanging="283"/>
       </w:pPr>
-      <w:r/>
       <w:r>
         <w:rPr>
+          <w:rFonts w:ascii="Arial" w:hAnsi="Arial"/>
+        </w:rPr>
+        <w:t xml:space="preserve">•  </w:t>
+      </w:r>
+      <w:r>
+        <w:rPr>
+          <w:rFonts w:ascii="Arial" w:hAnsi="Arial"/>
           <w:b/>
+          <w:sz w:val="20"/>
         </w:rPr>
         <w:t>[33]</w:t>
       </w:r>
       <w:r>
+        <w:rPr>
+          <w:rFonts w:ascii="Arial" w:hAnsi="Arial"/>
+          <w:sz w:val="20"/>
+        </w:rPr>
         <w:t xml:space="preserve"> Wang, D., Wang, Y., Liu, J., &amp; Zhang, Y. (2023). </w:t>
       </w:r>
       <w:r>
         <w:rPr>
+          <w:rFonts w:ascii="Arial" w:hAnsi="Arial"/>
           <w:i/>
+          <w:sz w:val="20"/>
         </w:rPr>
         <w:t>An Integrated Dynamic Modeling Method for Underwater Vehicle with Hull, Propeller and Rudder</w:t>
       </w:r>
       <w:r>
+        <w:rPr>
+          <w:rFonts w:ascii="Arial" w:hAnsi="Arial"/>
+          <w:sz w:val="20"/>
+        </w:rPr>
         <w:t>. Ocean Engineering, 282, 115036. https://doi.org/10.1016/j.oceaneng.2023.115036</w:t>
       </w:r>
-      <w:r/>
     </w:p>
     <w:p>
       <w:pPr>
-        <w:pStyle w:val="ListBullet"/>
-        <w:spacing w:line="240" w:lineRule="auto"/>
-        <w:ind w:left="720"/>
+        <w:spacing w:after="60"/>
+        <w:ind w:left="567" w:hanging="283"/>
       </w:pPr>
-      <w:r/>
       <w:r>
         <w:rPr>
+          <w:rFonts w:ascii="Arial" w:hAnsi="Arial"/>
+        </w:rPr>
+        <w:t xml:space="preserve">•  </w:t>
+      </w:r>
+      <w:r>
+        <w:rPr>
+          <w:rFonts w:ascii="Arial" w:hAnsi="Arial"/>
           <w:b/>
+          <w:sz w:val="20"/>
         </w:rPr>
         <w:t>[34]</w:t>
       </w:r>
       <w:r>
+        <w:rPr>
+          <w:rFonts w:ascii="Arial" w:hAnsi="Arial"/>
+          <w:sz w:val="20"/>
+        </w:rPr>
         <w:t xml:space="preserve"> Wei, X., Du, H., Yan, T., &amp; He, B. (2025). </w:t>
       </w:r>
       <w:r>
         <w:rPr>
+          <w:rFonts w:ascii="Arial" w:hAnsi="Arial"/>
           <w:i/>
+          <w:sz w:val="20"/>
         </w:rPr>
         <w:t>A Solution Method for Hydrodynamic Coefficients of Autonomous Underwater Vehicle Using Multi-Degree-of-Freedom Coupled Motion Data</w:t>
       </w:r>
       <w:r>
+        <w:rPr>
+          <w:rFonts w:ascii="Arial" w:hAnsi="Arial"/>
+          <w:sz w:val="20"/>
+        </w:rPr>
         <w:t>. Ocean Engineering, 341, 122653. https://doi.org/10.1016/j.oceaneng.2025.122653</w:t>
       </w:r>
-      <w:r/>
     </w:p>
     <w:p>
       <w:pPr>
-        <w:pStyle w:val="ListBullet"/>
-        <w:spacing w:line="240" w:lineRule="auto"/>
-        <w:ind w:left="720"/>
+        <w:spacing w:after="60"/>
+        <w:ind w:left="567" w:hanging="283"/>
       </w:pPr>
-      <w:r/>
       <w:r>
         <w:rPr>
+          <w:rFonts w:ascii="Arial" w:hAnsi="Arial"/>
+        </w:rPr>
+        <w:t xml:space="preserve">•  </w:t>
+      </w:r>
+      <w:r>
+        <w:rPr>
+          <w:rFonts w:ascii="Arial" w:hAnsi="Arial"/>
           <w:b/>
+          <w:sz w:val="20"/>
         </w:rPr>
         <w:t>[35]</w:t>
       </w:r>
       <w:r>
+        <w:rPr>
+          <w:rFonts w:ascii="Arial" w:hAnsi="Arial"/>
+          <w:sz w:val="20"/>
+        </w:rPr>
         <w:t xml:space="preserve"> Westman, E., Kaess, M., &amp; Hollinger, G. A. (2021). </w:t>
       </w:r>
       <w:r>
         <w:rPr>
+          <w:rFonts w:ascii="Arial" w:hAnsi="Arial"/>
           <w:i/>
+          <w:sz w:val="20"/>
         </w:rPr>
         <w:t>Towards Modular and Accessible AUV Systems</w:t>
       </w:r>
       <w:r>
+        <w:rPr>
+          <w:rFonts w:ascii="Arial" w:hAnsi="Arial"/>
+          <w:sz w:val="20"/>
+        </w:rPr>
         <w:t>. In 2021 IEEE Aerospace Conference (50100), pp. 1–10. https://doi.org/10.1109/AERO50100.2021.9438312</w:t>
       </w:r>
-      <w:r/>
     </w:p>
     <w:p>
       <w:pPr>
-        <w:pStyle w:val="ListBullet"/>
-        <w:spacing w:line="240" w:lineRule="auto"/>
-        <w:ind w:left="720"/>
+        <w:spacing w:after="60"/>
+        <w:ind w:left="567" w:hanging="283"/>
       </w:pPr>
-      <w:r/>
       <w:r>
         <w:rPr>
+          <w:rFonts w:ascii="Arial" w:hAnsi="Arial"/>
+        </w:rPr>
+        <w:t xml:space="preserve">•  </w:t>
+      </w:r>
+      <w:r>
+        <w:rPr>
+          <w:rFonts w:ascii="Arial" w:hAnsi="Arial"/>
           <w:b/>
+          <w:sz w:val="20"/>
         </w:rPr>
         <w:t>[36]</w:t>
       </w:r>
       <w:r>
+        <w:rPr>
+          <w:rFonts w:ascii="Arial" w:hAnsi="Arial"/>
+          <w:sz w:val="20"/>
+        </w:rPr>
         <w:t xml:space="preserve"> Widhalm, D., Ohnsted, C., Knutson, C., Kutzke, D., Singh, S., Mukherjee, R., Schwidder, G., Wu, Y.-K., &amp; Sattar, J. (2025). </w:t>
       </w:r>
       <w:r>
         <w:rPr>
+          <w:rFonts w:ascii="Arial" w:hAnsi="Arial"/>
           <w:i/>
+          <w:sz w:val="20"/>
         </w:rPr>
         <w:t>Design and Development of the MeCO Open-Source Autonomous Underwater Vehicle</w:t>
       </w:r>
       <w:r>
+        <w:rPr>
+          <w:rFonts w:ascii="Arial" w:hAnsi="Arial"/>
+          <w:sz w:val="20"/>
+        </w:rPr>
         <w:t>. In IEEE/RSJ International Conference on Intelligent Robots and Systems (IROS).</w:t>
       </w:r>
-      <w:r/>
     </w:p>
     <w:p>
       <w:pPr>
-        <w:pStyle w:val="ListBullet"/>
-        <w:spacing w:line="240" w:lineRule="auto"/>
-        <w:ind w:left="720"/>
+        <w:spacing w:after="60"/>
+        <w:ind w:left="567" w:hanging="283"/>
       </w:pPr>
-      <w:r/>
       <w:r>
         <w:rPr>
+          <w:rFonts w:ascii="Arial" w:hAnsi="Arial"/>
+        </w:rPr>
+        <w:t xml:space="preserve">•  </w:t>
+      </w:r>
+      <w:r>
+        <w:rPr>
+          <w:rFonts w:ascii="Arial" w:hAnsi="Arial"/>
           <w:b/>
+          <w:sz w:val="20"/>
         </w:rPr>
         <w:t>[37]</w:t>
       </w:r>
       <w:r>
+        <w:rPr>
+          <w:rFonts w:ascii="Arial" w:hAnsi="Arial"/>
+          <w:sz w:val="20"/>
+        </w:rPr>
         <w:t xml:space="preserve"> Xia, T., Liu, S., Wang, T., Li, J., Lin, W., Zhang, B., Cai, Y., &amp; Xu, W. (2025). </w:t>
       </w:r>
       <w:r>
         <w:rPr>
+          <w:rFonts w:ascii="Arial" w:hAnsi="Arial"/>
           <w:i/>
+          <w:sz w:val="20"/>
         </w:rPr>
         <w:t>Experimental and Numerical Analysis on Two-Way Hull–Propeller Coupled Effect of a Fully-Actuated AUV</w:t>
       </w:r>
       <w:r>
+        <w:rPr>
+          <w:rFonts w:ascii="Arial" w:hAnsi="Arial"/>
+          <w:sz w:val="20"/>
+        </w:rPr>
         <w:t>. Ocean Engineering, 321, 120288. https://doi.org/10.1016/j.oceaneng.2025.120288</w:t>
       </w:r>
-      <w:r/>
     </w:p>
     <w:p>
       <w:pPr>
-        <w:pStyle w:val="ListBullet"/>
-        <w:spacing w:line="240" w:lineRule="auto"/>
-        <w:ind w:left="720"/>
+        <w:spacing w:after="60"/>
+        <w:ind w:left="567" w:hanging="283"/>
       </w:pPr>
-      <w:r/>
       <w:r>
         <w:rPr>
+          <w:rFonts w:ascii="Arial" w:hAnsi="Arial"/>
+        </w:rPr>
+        <w:t xml:space="preserve">•  </w:t>
+      </w:r>
+      <w:r>
+        <w:rPr>
+          <w:rFonts w:ascii="Arial" w:hAnsi="Arial"/>
           <w:b/>
+          <w:sz w:val="20"/>
         </w:rPr>
         <w:t>[38]</w:t>
       </w:r>
       <w:r>
+        <w:rPr>
+          <w:rFonts w:ascii="Arial" w:hAnsi="Arial"/>
+          <w:sz w:val="20"/>
+        </w:rPr>
         <w:t xml:space="preserve"> Yang, Y., Xiao, Y., &amp; Li, T. (2021). </w:t>
       </w:r>
       <w:r>
         <w:rPr>
+          <w:rFonts w:ascii="Arial" w:hAnsi="Arial"/>
           <w:i/>
+          <w:sz w:val="20"/>
         </w:rPr>
         <w:t>A Survey of Autonomous Underwater Vehicle Formation: Performance, Formation Control, and Communication Capability</w:t>
       </w:r>
       <w:r>
+        <w:rPr>
+          <w:rFonts w:ascii="Arial" w:hAnsi="Arial"/>
+          <w:sz w:val="20"/>
+        </w:rPr>
         <w:t>. IEEE Communications Surveys &amp; Tutorials, 23(2), 1270–1304. https://doi.org/10.1109/COMST.2021.3059418</w:t>
       </w:r>
-      <w:r/>
     </w:p>
     <w:p>
       <w:pPr>
-        <w:pStyle w:val="ListBullet"/>
-        <w:spacing w:line="240" w:lineRule="auto"/>
-        <w:ind w:left="720"/>
+        <w:spacing w:after="60"/>
+        <w:ind w:left="567" w:hanging="283"/>
       </w:pPr>
-      <w:r/>
       <w:r>
         <w:rPr>
+          <w:rFonts w:ascii="Arial" w:hAnsi="Arial"/>
+        </w:rPr>
+        <w:t xml:space="preserve">•  </w:t>
+      </w:r>
+      <w:r>
+        <w:rPr>
+          <w:rFonts w:ascii="Arial" w:hAnsi="Arial"/>
           <w:b/>
+          <w:sz w:val="20"/>
         </w:rPr>
         <w:t>[39]</w:t>
       </w:r>
       <w:r>
+        <w:rPr>
+          <w:rFonts w:ascii="Arial" w:hAnsi="Arial"/>
+          <w:sz w:val="20"/>
+        </w:rPr>
         <w:t xml:space="preserve"> Zhang, B., Ji, D., Liu, S., Zhu, X., &amp; Xu, W. (2023). </w:t>
       </w:r>
       <w:r>
         <w:rPr>
+          <w:rFonts w:ascii="Arial" w:hAnsi="Arial"/>
           <w:i/>
+          <w:sz w:val="20"/>
         </w:rPr>
         <w:t>Autonomous Underwater Vehicle Navigation: A Review</w:t>
       </w:r>
       <w:r>
+        <w:rPr>
+          <w:rFonts w:ascii="Arial" w:hAnsi="Arial"/>
+          <w:sz w:val="20"/>
+        </w:rPr>
         <w:t>. Ocean Engineering, 273, 113861. https://doi.org/10.1016/j.oceaneng.2023.113861</w:t>
       </w:r>
-      <w:r/>
     </w:p>
     <w:p>
       <w:pPr>
-        <w:pStyle w:val="ListBullet"/>
-        <w:spacing w:line="240" w:lineRule="auto"/>
-        <w:ind w:left="720"/>
+        <w:spacing w:after="60"/>
+        <w:ind w:left="567" w:hanging="283"/>
       </w:pPr>
-      <w:r/>
       <w:r>
         <w:rPr>
+          <w:rFonts w:ascii="Arial" w:hAnsi="Arial"/>
+        </w:rPr>
+        <w:t xml:space="preserve">•  </w:t>
+      </w:r>
+      <w:r>
+        <w:rPr>
+          <w:rFonts w:ascii="Arial" w:hAnsi="Arial"/>
           <w:b/>
+          <w:sz w:val="20"/>
         </w:rPr>
         <w:t>[40]</w:t>
       </w:r>
       <w:r>
+        <w:rPr>
+          <w:rFonts w:ascii="Arial" w:hAnsi="Arial"/>
+          <w:sz w:val="20"/>
+        </w:rPr>
         <w:t xml:space="preserve"> Zhang, Y., Zhang, J., Guo, Z., Zhang, L., &amp; Shang, Y. (2025). </w:t>
       </w:r>
       <w:r>
         <w:rPr>
+          <w:rFonts w:ascii="Arial" w:hAnsi="Arial"/>
           <w:i/>
+          <w:sz w:val="20"/>
         </w:rPr>
         <w:t>An Adaptive NMPC for ROVs Trajectory Tracking with Environmental Disturbances and Model Uncertainties</w:t>
       </w:r>
       <w:r>
+        <w:rPr>
+          <w:rFonts w:ascii="Arial" w:hAnsi="Arial"/>
+          <w:sz w:val="20"/>
+        </w:rPr>
         <w:t>. Brodogradnja, 76(1), 1–25. https://doi.org/10.21278/brod76101</w:t>
       </w:r>
-      <w:r/>
     </w:p>
     <w:p>
       <w:pPr>
-        <w:pStyle w:val="ListBullet"/>
-        <w:spacing w:line="240" w:lineRule="auto"/>
-        <w:ind w:left="720"/>
+        <w:spacing w:after="60"/>
+        <w:ind w:left="567" w:hanging="283"/>
       </w:pPr>
-      <w:r/>
       <w:r>
         <w:rPr>
+          <w:rFonts w:ascii="Arial" w:hAnsi="Arial"/>
+        </w:rPr>
+        <w:t xml:space="preserve">•  </w:t>
+      </w:r>
+      <w:r>
+        <w:rPr>
+          <w:rFonts w:ascii="Arial" w:hAnsi="Arial"/>
           <w:b/>
+          <w:sz w:val="20"/>
         </w:rPr>
         <w:t>[41]</w:t>
       </w:r>
       <w:r>
+        <w:rPr>
+          <w:rFonts w:ascii="Arial" w:hAnsi="Arial"/>
+          <w:sz w:val="20"/>
+        </w:rPr>
         <w:t xml:space="preserve"> Zuluaga, C. A., Aristizábal, L. M., Rúa, S., Franco, D. A., Osorio, D. A., &amp; Vásquez, R. E. (2022). </w:t>
       </w:r>
       <w:r>
         <w:rPr>
+          <w:rFonts w:ascii="Arial" w:hAnsi="Arial"/>
           <w:i/>
+          <w:sz w:val="20"/>
         </w:rPr>
         <w:t>Development of a Modular Software Architecture for Underwater Vehicles Using Systems Engineering</w:t>
       </w:r>
       <w:r>
+        <w:rPr>
+          <w:rFonts w:ascii="Arial" w:hAnsi="Arial"/>
+          <w:sz w:val="20"/>
+        </w:rPr>
         <w:t>. Journal of Marine Science and Engineering, 10(9), 1276. https://doi.org/10.3390/jmse10091276</w:t>
       </w:r>
-      <w:r/>
     </w:p>
     <w:sectPr>
-      <w:pgSz w:w="12240" w:h="15840"/>
-      <w:pgMar w:top="1440" w:right="1440" w:bottom="1440" w:left="1728" w:header="720" w:footer="720" w:gutter="0"/>
+      <w:pgSz w:w="9978" w:h="14173"/>
+      <w:pgMar w:top="1276" w:right="1276" w:bottom="1276" w:left="1276" w:header="720" w:footer="720" w:gutter="0"/>
       <w:cols w:space="720"/>
       <w:docGrid w:linePitch="360"/>
     </w:sectPr>
@@ -1589,12 +2315,13 @@
     <w:qFormat/>
     <w:rsid w:val="00FC693F"/>
     <w:pPr>
-      <w:spacing w:line="276" w:lineRule="auto" w:after="120"/>
+      <w:spacing w:line="276" w:lineRule="auto" w:after="80"/>
+      <w:jc w:val="both"/>
     </w:pPr>
     <w:rPr>
       <w:rFonts w:ascii="Arial" w:hAnsi="Arial"/>
       <w:color w:val="111111"/>
-      <w:sz w:val="22"/>
+      <w:sz w:val="20"/>
     </w:rPr>
   </w:style>
   <w:style w:type="paragraph" w:styleId="Header">

</xml_diff>

<commit_message>
Optimize DOCX for Google Docs editing, eliminate word fusing, and add native heading styles
</commit_message>
<xml_diff>
--- a/Thesis/docx_export/MASTER_BIBLIOGRAPHY.docx
+++ b/Thesis/docx_export/MASTER_BIBLIOGRAPHY.docx
@@ -4,7 +4,10 @@
   <w:body>
     <w:p>
       <w:pPr>
-        <w:spacing w:before="240" w:after="240"/>
+        <w:pStyle w:val="Heading1"/>
+        <w:keepNext/>
+        <w:spacing w:before="240" w:after="240" w:line="276" w:lineRule="auto"/>
+        <w:ind w:firstLine="0"/>
         <w:jc w:val="center"/>
       </w:pPr>
       <w:r>
@@ -1215,10 +1218,10 @@
   <w:docDefaults>
     <w:rPrDefault>
       <w:rPr>
-        <w:rFonts w:asciiTheme="minorHAnsi" w:eastAsiaTheme="minorEastAsia" w:hAnsiTheme="minorHAnsi" w:cstheme="minorBidi"/>
         <w:sz w:val="22"/>
         <w:szCs w:val="22"/>
         <w:lang w:val="en-US" w:eastAsia="en-US" w:bidi="ar-SA"/>
+        <w:rFonts w:ascii="Arial" w:hAnsi="Arial" w:cs="Arial" w:eastAsia="Arial"/>
       </w:rPr>
     </w:rPrDefault>
     <w:pPrDefault>
@@ -1375,9 +1378,9 @@
       <w:jc w:val="both"/>
     </w:pPr>
     <w:rPr>
-      <w:rFonts w:ascii="Arial" w:hAnsi="Arial"/>
       <w:color w:val="111111"/>
       <w:sz w:val="20"/>
+      <w:rFonts w:ascii="Arial" w:hAnsi="Arial" w:cs="Arial" w:eastAsia="Arial"/>
     </w:rPr>
   </w:style>
   <w:style w:type="paragraph" w:styleId="Header">
@@ -1435,16 +1438,17 @@
     <w:pPr>
       <w:keepNext/>
       <w:keepLines/>
-      <w:spacing w:before="480" w:after="0"/>
+      <w:spacing w:before="240" w:after="240" w:line="276" w:lineRule="auto"/>
+      <w:jc w:val="center"/>
       <w:outlineLvl w:val="0"/>
     </w:pPr>
     <w:rPr>
-      <w:rFonts w:asciiTheme="majorHAnsi" w:eastAsiaTheme="majorEastAsia" w:hAnsiTheme="majorHAnsi" w:cstheme="majorBidi"/>
       <w:b/>
       <w:bCs/>
-      <w:color w:val="365F91" w:themeColor="accent1" w:themeShade="BF"/>
-      <w:sz w:val="28"/>
+      <w:color w:val="111111"/>
+      <w:sz w:val="22"/>
       <w:szCs w:val="28"/>
+      <w:rFonts w:ascii="Arial" w:hAnsi="Arial" w:cs="Arial" w:eastAsia="Arial"/>
     </w:rPr>
   </w:style>
   <w:style w:type="paragraph" w:styleId="Heading2">
@@ -1459,16 +1463,17 @@
     <w:pPr>
       <w:keepNext/>
       <w:keepLines/>
-      <w:spacing w:before="200" w:after="0"/>
+      <w:spacing w:before="200" w:after="80" w:line="276" w:lineRule="auto"/>
+      <w:jc w:val="left"/>
       <w:outlineLvl w:val="1"/>
     </w:pPr>
     <w:rPr>
-      <w:rFonts w:asciiTheme="majorHAnsi" w:eastAsiaTheme="majorEastAsia" w:hAnsiTheme="majorHAnsi" w:cstheme="majorBidi"/>
       <w:b/>
       <w:bCs/>
-      <w:color w:val="4F81BD" w:themeColor="accent1"/>
-      <w:sz w:val="26"/>
+      <w:color w:val="111111"/>
+      <w:sz w:val="20"/>
       <w:szCs w:val="26"/>
+      <w:rFonts w:ascii="Arial" w:hAnsi="Arial" w:cs="Arial" w:eastAsia="Arial"/>
     </w:rPr>
   </w:style>
   <w:style w:type="paragraph" w:styleId="Heading3">
@@ -1483,14 +1488,16 @@
     <w:pPr>
       <w:keepNext/>
       <w:keepLines/>
-      <w:spacing w:before="200" w:after="0"/>
+      <w:spacing w:before="160" w:after="40" w:line="276" w:lineRule="auto"/>
+      <w:jc w:val="left"/>
       <w:outlineLvl w:val="2"/>
     </w:pPr>
     <w:rPr>
-      <w:rFonts w:asciiTheme="majorHAnsi" w:eastAsiaTheme="majorEastAsia" w:hAnsiTheme="majorHAnsi" w:cstheme="majorBidi"/>
       <w:b/>
       <w:bCs/>
-      <w:color w:val="4F81BD" w:themeColor="accent1"/>
+      <w:color w:val="111111"/>
+      <w:sz w:val="20"/>
+      <w:rFonts w:ascii="Arial" w:hAnsi="Arial" w:cs="Arial" w:eastAsia="Arial"/>
     </w:rPr>
   </w:style>
   <w:style w:type="paragraph" w:styleId="Heading4">

</xml_diff>